<commit_message>
fix(fee-proposal): remove repeating Description/Amount headers in PC/PS section
The "Description" and "Amount" header paragraphs sat INSIDE the {#PC_SUMS} loop, so they reprinted
before every prime-cost / provisional-sum line. Generator cleanup now drops them (scoped to the loop),
leaving a clean {PC_DESCRIPTION}/{PC_AMOUNT} list. Verified: 0 header repeats in the rendered preview.

Co-Authored-By: Claude Opus 4.8 (1M context) <noreply@anthropic.com>
</commit_message>
<xml_diff>
--- a/docs/fee-proposal-apb-template.docx
+++ b/docs/fee-proposal-apb-template.docx
@@ -2500,22 +2500,6 @@
               <w:end w:w="120" w:type="dxa"/>
             </w:tcMar>
           </w:tcPr>
-          <w:p/>
-          <w:p>
-            <w:pPr>
-              <w:spacing w:after="0"/>
-            </w:pPr>
-            <w:r>
-              <w:rPr>
-                <w:rFonts w:ascii="Open Sans" w:hAnsi="Open Sans" w:eastAsia="Open Sans"/>
-                <w:b/>
-                <w:i w:val="0"/>
-                <w:color w:val="FFFFFF"/>
-                <w:sz w:val="16"/>
-              </w:rPr>
-              <w:t>Description</w:t>
-            </w:r>
-          </w:p>
         </w:tc>
         <w:tc>
           <w:tcPr>
@@ -2528,23 +2512,6 @@
               <w:end w:w="120" w:type="dxa"/>
             </w:tcMar>
           </w:tcPr>
-          <w:p/>
-          <w:p>
-            <w:pPr>
-              <w:spacing w:after="0"/>
-              <w:jc w:val="right"/>
-            </w:pPr>
-            <w:r>
-              <w:rPr>
-                <w:rFonts w:ascii="Open Sans" w:hAnsi="Open Sans" w:eastAsia="Open Sans"/>
-                <w:b/>
-                <w:i w:val="0"/>
-                <w:color w:val="FFFFFF"/>
-                <w:sz w:val="16"/>
-              </w:rPr>
-              <w:t>Amount</w:t>
-            </w:r>
-          </w:p>
         </w:tc>
       </w:tr>
       <w:tr>

</xml_diff>

<commit_message>
fix(fee-proposal): collapse Quote Summary + Fee Schedule to single tables (APB critique)
Grounded critique (APB knowledge + doc ground-truth + ChatGPT feedback) confirmed the #1 length driver:
the {#SUMMARY_ROWS} and {#FEE_SCHEDULE} loops wrapped the WHOLE table, so the header reprinted once per
row — 30 one-row tables for the quote summary (~5 pages), 7 for the fee schedule.

Generator now converts both to the docxtemplater table-ROW loop (loop tags moved into the data-row
cells): one table, header once, the row repeating. Verified on Q1196: "Cost inc GST"/"Milestone"
headers print 1x (was 30/7), total tables 104 -> 69, 0 leftover tags. Quote summary 5pp -> ~1pp.

Also de-blank the Introduction (keep the APB director-signed letter, drop its forced page break so it
flows instead of taking a near-empty page).

Co-Authored-By: Claude Opus 4.8 (1M context) <noreply@anthropic.com>
</commit_message>
<xml_diff>
--- a/docs/fee-proposal-apb-template.docx
+++ b/docs/fee-proposal-apb-template.docx
@@ -905,9 +905,7 @@
       </w:r>
     </w:p>
     <w:p>
-      <w:r>
-        <w:br w:type="page"/>
-      </w:r>
+      <w:r/>
     </w:p>
     <w:p>
       <w:pPr>
@@ -4197,21 +4195,6 @@
         <w:spacing w:after="160"/>
       </w:pPr>
     </w:p>
-    <w:p>
-      <w:pPr>
-        <w:spacing w:after="120"/>
-      </w:pPr>
-      <w:r>
-        <w:rPr>
-          <w:rFonts w:ascii="Open Sans" w:hAnsi="Open Sans" w:eastAsia="Open Sans"/>
-          <w:b w:val="0"/>
-          <w:i w:val="0"/>
-          <w:color w:val="FFFFFF"/>
-          <w:sz w:val="2"/>
-        </w:rPr>
-        <w:t>{#SUMMARY_ROWS}</w:t>
-      </w:r>
-    </w:p>
     <w:tbl>
       <w:tblPr>
         <w:tblW w:type="auto" w:w="0"/>
@@ -4310,7 +4293,7 @@
                 <w:color w:val="2B2B2B"/>
                 <w:sz w:val="19"/>
               </w:rPr>
-              <w:t>{CATEGORY_NAME}</w:t>
+              <w:t>{#SUMMARY_ROWS}{CATEGORY_NAME}</w:t>
             </w:r>
           </w:p>
         </w:tc>
@@ -4338,27 +4321,12 @@
                 <w:color w:val="2B2B2B"/>
                 <w:sz w:val="19"/>
               </w:rPr>
-              <w:t>{CATEGORY_COST_GST}</w:t>
+              <w:t>{CATEGORY_COST_GST}{/SUMMARY_ROWS}</w:t>
             </w:r>
           </w:p>
         </w:tc>
       </w:tr>
     </w:tbl>
-    <w:p>
-      <w:pPr>
-        <w:spacing w:after="120"/>
-      </w:pPr>
-      <w:r>
-        <w:rPr>
-          <w:rFonts w:ascii="Open Sans" w:hAnsi="Open Sans" w:eastAsia="Open Sans"/>
-          <w:b w:val="0"/>
-          <w:i w:val="0"/>
-          <w:color w:val="FFFFFF"/>
-          <w:sz w:val="2"/>
-        </w:rPr>
-        <w:t>{/SUMMARY_ROWS}</w:t>
-      </w:r>
-    </w:p>
     <w:p>
       <w:pPr>
         <w:spacing w:before="400" w:after="0"/>
@@ -4516,21 +4484,6 @@
         <w:spacing w:after="160"/>
       </w:pPr>
     </w:p>
-    <w:p>
-      <w:pPr>
-        <w:spacing w:after="120"/>
-      </w:pPr>
-      <w:r>
-        <w:rPr>
-          <w:rFonts w:ascii="Open Sans" w:hAnsi="Open Sans" w:eastAsia="Open Sans"/>
-          <w:b w:val="0"/>
-          <w:i w:val="0"/>
-          <w:color w:val="FFFFFF"/>
-          <w:sz w:val="2"/>
-        </w:rPr>
-        <w:t>{#FEE_SCHEDULE}</w:t>
-      </w:r>
-    </w:p>
     <w:tbl>
       <w:tblPr>
         <w:tblW w:type="auto" w:w="0"/>
@@ -4660,7 +4613,7 @@
                 <w:color w:val="2B2B2B"/>
                 <w:sz w:val="19"/>
               </w:rPr>
-              <w:t>{STAGE_CLAIM}</w:t>
+              <w:t>{#FEE_SCHEDULE}{STAGE_CLAIM}</w:t>
             </w:r>
           </w:p>
         </w:tc>
@@ -4716,27 +4669,12 @@
                 <w:color w:val="2B2B2B"/>
                 <w:sz w:val="19"/>
               </w:rPr>
-              <w:t>{PERCENTAGE}</w:t>
+              <w:t>{PERCENTAGE}{/FEE_SCHEDULE}</w:t>
             </w:r>
           </w:p>
         </w:tc>
       </w:tr>
     </w:tbl>
-    <w:p>
-      <w:pPr>
-        <w:spacing w:after="120"/>
-      </w:pPr>
-      <w:r>
-        <w:rPr>
-          <w:rFonts w:ascii="Open Sans" w:hAnsi="Open Sans" w:eastAsia="Open Sans"/>
-          <w:b w:val="0"/>
-          <w:i w:val="0"/>
-          <w:color w:val="FFFFFF"/>
-          <w:sz w:val="2"/>
-        </w:rPr>
-        <w:t>{/FEE_SCHEDULE}</w:t>
-      </w:r>
-    </w:p>
     <w:p>
       <w:r/>
     </w:p>

</xml_diff>

<commit_message>
style(fee-proposal): density pass — thin divider rules, tighter cell padding, all-blue footer
Layout spacing only (no content or merge-tag changes) per review:
- Blue divider blocks under headings: empty 006C9B cells were ~14pt blocks → replaced their empty
  paragraph with a 4.5pt exact-height line (thin brand rule). 19/21 converted.
- Cell padding tcMar 220tw (11pt) → 100tw (5pt) on banners + PC/PS/summary/fee tables (56 cells) —
  compacts the loose rows.
- Footer: all elements now brand blue #006C9B (was mixed with grey).
Image strips left at 25-30mm (already within the 25-35mm spec). Renders clean, 0 leftover tags.

Co-Authored-By: Claude Opus 4.8 (1M context) <noreply@anthropic.com>
</commit_message>
<xml_diff>
--- a/docs/fee-proposal-apb-template.docx
+++ b/docs/fee-proposal-apb-template.docx
@@ -293,7 +293,14 @@
               <w:insideV w:val="nil"/>
             </w:tcBorders>
           </w:tcPr>
-          <w:p/>
+          <w:p>
+            <w:pPr>
+              <w:spacing w:before="0" w:after="0" w:line="90" w:lineRule="exact"/>
+              <w:rPr>
+                <w:sz w:val="6"/>
+              </w:rPr>
+            </w:pPr>
+          </w:p>
         </w:tc>
       </w:tr>
     </w:tbl>
@@ -327,10 +334,10 @@
             </w:tcBorders>
             <w:shd w:fill="F4F7F8"/>
             <w:tcMar>
-              <w:top w:w="220" w:type="dxa"/>
-              <w:start w:w="220" w:type="dxa"/>
-              <w:bottom w:w="220" w:type="dxa"/>
-              <w:end w:w="220" w:type="dxa"/>
+              <w:top w:w="100" w:type="dxa"/>
+              <w:start w:w="100" w:type="dxa"/>
+              <w:bottom w:w="100" w:type="dxa"/>
+              <w:end w:w="100" w:type="dxa"/>
             </w:tcMar>
           </w:tcPr>
           <w:p/>
@@ -468,10 +475,10 @@
             </w:tcBorders>
             <w:shd w:fill="FFFFFF"/>
             <w:tcMar>
-              <w:top w:w="220" w:type="dxa"/>
-              <w:start w:w="220" w:type="dxa"/>
-              <w:bottom w:w="220" w:type="dxa"/>
-              <w:end w:w="220" w:type="dxa"/>
+              <w:top w:w="100" w:type="dxa"/>
+              <w:start w:w="100" w:type="dxa"/>
+              <w:bottom w:w="100" w:type="dxa"/>
+              <w:end w:w="100" w:type="dxa"/>
             </w:tcMar>
           </w:tcPr>
           <w:p/>
@@ -640,7 +647,14 @@
               <w:insideV w:val="nil"/>
             </w:tcBorders>
           </w:tcPr>
-          <w:p/>
+          <w:p>
+            <w:pPr>
+              <w:spacing w:before="0" w:after="0" w:line="90" w:lineRule="exact"/>
+              <w:rPr>
+                <w:sz w:val="6"/>
+              </w:rPr>
+            </w:pPr>
+          </w:p>
         </w:tc>
       </w:tr>
     </w:tbl>
@@ -993,7 +1007,14 @@
               <w:insideV w:val="nil"/>
             </w:tcBorders>
           </w:tcPr>
-          <w:p/>
+          <w:p>
+            <w:pPr>
+              <w:spacing w:before="0" w:after="0" w:line="90" w:lineRule="exact"/>
+              <w:rPr>
+                <w:sz w:val="6"/>
+              </w:rPr>
+            </w:pPr>
+          </w:p>
         </w:tc>
       </w:tr>
     </w:tbl>
@@ -1189,7 +1210,14 @@
               <w:insideV w:val="nil"/>
             </w:tcBorders>
           </w:tcPr>
-          <w:p/>
+          <w:p>
+            <w:pPr>
+              <w:spacing w:before="0" w:after="0" w:line="90" w:lineRule="exact"/>
+              <w:rPr>
+                <w:sz w:val="6"/>
+              </w:rPr>
+            </w:pPr>
+          </w:p>
         </w:tc>
       </w:tr>
     </w:tbl>
@@ -1352,7 +1380,14 @@
               <w:insideV w:val="nil"/>
             </w:tcBorders>
           </w:tcPr>
-          <w:p/>
+          <w:p>
+            <w:pPr>
+              <w:spacing w:before="0" w:after="0" w:line="90" w:lineRule="exact"/>
+              <w:rPr>
+                <w:sz w:val="6"/>
+              </w:rPr>
+            </w:pPr>
+          </w:p>
         </w:tc>
       </w:tr>
     </w:tbl>
@@ -1700,7 +1735,14 @@
               <w:insideV w:val="nil"/>
             </w:tcBorders>
           </w:tcPr>
-          <w:p/>
+          <w:p>
+            <w:pPr>
+              <w:spacing w:before="0" w:after="0" w:line="90" w:lineRule="exact"/>
+              <w:rPr>
+                <w:sz w:val="6"/>
+              </w:rPr>
+            </w:pPr>
+          </w:p>
         </w:tc>
       </w:tr>
     </w:tbl>
@@ -1933,7 +1975,14 @@
               <w:insideV w:val="nil"/>
             </w:tcBorders>
           </w:tcPr>
-          <w:p/>
+          <w:p>
+            <w:pPr>
+              <w:spacing w:before="0" w:after="0" w:line="90" w:lineRule="exact"/>
+              <w:rPr>
+                <w:sz w:val="6"/>
+              </w:rPr>
+            </w:pPr>
+          </w:p>
         </w:tc>
       </w:tr>
     </w:tbl>
@@ -2228,7 +2277,14 @@
               <w:insideV w:val="nil"/>
             </w:tcBorders>
           </w:tcPr>
-          <w:p/>
+          <w:p>
+            <w:pPr>
+              <w:spacing w:before="0" w:after="0" w:line="90" w:lineRule="exact"/>
+              <w:rPr>
+                <w:sz w:val="6"/>
+              </w:rPr>
+            </w:pPr>
+          </w:p>
         </w:tc>
       </w:tr>
     </w:tbl>
@@ -2433,7 +2489,14 @@
               <w:insideV w:val="nil"/>
             </w:tcBorders>
           </w:tcPr>
-          <w:p/>
+          <w:p>
+            <w:pPr>
+              <w:spacing w:before="0" w:after="0" w:line="90" w:lineRule="exact"/>
+              <w:rPr>
+                <w:sz w:val="6"/>
+              </w:rPr>
+            </w:pPr>
+          </w:p>
         </w:tc>
       </w:tr>
     </w:tbl>
@@ -2685,7 +2748,14 @@
               <w:insideV w:val="nil"/>
             </w:tcBorders>
           </w:tcPr>
-          <w:p/>
+          <w:p>
+            <w:pPr>
+              <w:spacing w:before="0" w:after="0" w:line="90" w:lineRule="exact"/>
+              <w:rPr>
+                <w:sz w:val="6"/>
+              </w:rPr>
+            </w:pPr>
+          </w:p>
         </w:tc>
       </w:tr>
     </w:tbl>
@@ -2916,7 +2986,14 @@
               <w:insideV w:val="nil"/>
             </w:tcBorders>
           </w:tcPr>
-          <w:p/>
+          <w:p>
+            <w:pPr>
+              <w:spacing w:before="0" w:after="0" w:line="90" w:lineRule="exact"/>
+              <w:rPr>
+                <w:sz w:val="6"/>
+              </w:rPr>
+            </w:pPr>
+          </w:p>
         </w:tc>
       </w:tr>
     </w:tbl>
@@ -3338,7 +3415,14 @@
               <w:insideV w:val="nil"/>
             </w:tcBorders>
           </w:tcPr>
-          <w:p/>
+          <w:p>
+            <w:pPr>
+              <w:spacing w:before="0" w:after="0" w:line="90" w:lineRule="exact"/>
+              <w:rPr>
+                <w:sz w:val="6"/>
+              </w:rPr>
+            </w:pPr>
+          </w:p>
         </w:tc>
       </w:tr>
     </w:tbl>
@@ -3545,7 +3629,14 @@
               <w:insideV w:val="nil"/>
             </w:tcBorders>
           </w:tcPr>
-          <w:p/>
+          <w:p>
+            <w:pPr>
+              <w:spacing w:before="0" w:after="0" w:line="90" w:lineRule="exact"/>
+              <w:rPr>
+                <w:sz w:val="6"/>
+              </w:rPr>
+            </w:pPr>
+          </w:p>
         </w:tc>
       </w:tr>
     </w:tbl>
@@ -3746,7 +3837,14 @@
               <w:insideV w:val="nil"/>
             </w:tcBorders>
           </w:tcPr>
-          <w:p/>
+          <w:p>
+            <w:pPr>
+              <w:spacing w:before="0" w:after="0" w:line="90" w:lineRule="exact"/>
+              <w:rPr>
+                <w:sz w:val="6"/>
+              </w:rPr>
+            </w:pPr>
+          </w:p>
         </w:tc>
       </w:tr>
     </w:tbl>
@@ -4026,7 +4124,14 @@
               <w:insideV w:val="nil"/>
             </w:tcBorders>
           </w:tcPr>
-          <w:p/>
+          <w:p>
+            <w:pPr>
+              <w:spacing w:before="0" w:after="0" w:line="90" w:lineRule="exact"/>
+              <w:rPr>
+                <w:sz w:val="6"/>
+              </w:rPr>
+            </w:pPr>
+          </w:p>
         </w:tc>
       </w:tr>
     </w:tbl>
@@ -4186,7 +4291,14 @@
               <w:insideV w:val="nil"/>
             </w:tcBorders>
           </w:tcPr>
-          <w:p/>
+          <w:p>
+            <w:pPr>
+              <w:spacing w:before="0" w:after="0" w:line="90" w:lineRule="exact"/>
+              <w:rPr>
+                <w:sz w:val="6"/>
+              </w:rPr>
+            </w:pPr>
+          </w:p>
         </w:tc>
       </w:tr>
     </w:tbl>
@@ -4475,7 +4587,14 @@
               <w:insideV w:val="nil"/>
             </w:tcBorders>
           </w:tcPr>
-          <w:p/>
+          <w:p>
+            <w:pPr>
+              <w:spacing w:before="0" w:after="0" w:line="90" w:lineRule="exact"/>
+              <w:rPr>
+                <w:sz w:val="6"/>
+              </w:rPr>
+            </w:pPr>
+          </w:p>
         </w:tc>
       </w:tr>
     </w:tbl>
@@ -4764,7 +4883,14 @@
               <w:insideV w:val="nil"/>
             </w:tcBorders>
           </w:tcPr>
-          <w:p/>
+          <w:p>
+            <w:pPr>
+              <w:spacing w:before="0" w:after="0" w:line="90" w:lineRule="exact"/>
+              <w:rPr>
+                <w:sz w:val="6"/>
+              </w:rPr>
+            </w:pPr>
+          </w:p>
         </w:tc>
       </w:tr>
     </w:tbl>
@@ -5114,7 +5240,14 @@
               <w:insideV w:val="nil"/>
             </w:tcBorders>
           </w:tcPr>
-          <w:p/>
+          <w:p>
+            <w:pPr>
+              <w:spacing w:before="0" w:after="0" w:line="90" w:lineRule="exact"/>
+              <w:rPr>
+                <w:sz w:val="6"/>
+              </w:rPr>
+            </w:pPr>
+          </w:p>
         </w:tc>
       </w:tr>
     </w:tbl>
@@ -5352,7 +5485,7 @@
               <w:rFonts w:ascii="Open Sans" w:hAnsi="Open Sans" w:eastAsia="Open Sans"/>
               <w:b w:val="0"/>
               <w:i w:val="0"/>
-              <w:color w:val="6B6B6B"/>
+              <w:color w:val="006C9B"/>
               <w:sz w:val="16"/>
             </w:rPr>
             <w:t>www.blueleafbuilding.com.au</w:t>
@@ -5387,7 +5520,7 @@
               <w:rFonts w:ascii="Open Sans" w:hAnsi="Open Sans" w:eastAsia="Open Sans"/>
               <w:b w:val="0"/>
               <w:i w:val="0"/>
-              <w:color w:val="6B6B6B"/>
+              <w:color w:val="006C9B"/>
               <w:sz w:val="16"/>
             </w:rPr>
             <w:t xml:space="preserve">| </w:t>

</xml_diff>

<commit_message>
style(fee-proposal): density pass II + Client Portal redesign
PC_SUMS: remove Description/Amount header row; apply rowLoop so data row
repeats per item (no header repeat, ~3 pages saved). Remove lead empty
paragraph from every table cell (~6pt dead space per cell). Top-align all
cells. Reduce paragraph spacing inside tables after=120->40, after=200->60.
Online PM: 3-card row replaced with 2x3 feature grid (Progress Photos, Live
Schedule, Selections, Variations, Documents, Meetings) plus portal-activity
checklist (8 items, 2-col) plus screenshot placeholder frame. All renders
clean: 0 leftover merge tags on Q1196 sample.

Co-Authored-By: Claude Opus 4.8 <noreply@anthropic.com>
</commit_message>
<xml_diff>
--- a/docs/fee-proposal-apb-template.docx
+++ b/docs/fee-proposal-apb-template.docx
@@ -292,6 +292,7 @@
               <w:insideH w:val="nil"/>
               <w:insideV w:val="nil"/>
             </w:tcBorders>
+            <w:vAlign w:val="top"/>
           </w:tcPr>
           <w:p>
             <w:pPr>
@@ -339,8 +340,8 @@
               <w:bottom w:w="100" w:type="dxa"/>
               <w:end w:w="100" w:type="dxa"/>
             </w:tcMar>
+            <w:vAlign w:val="top"/>
           </w:tcPr>
-          <w:p/>
           <w:p>
             <w:pPr>
               <w:spacing w:after="20"/>
@@ -358,7 +359,7 @@
           </w:p>
           <w:p>
             <w:pPr>
-              <w:spacing w:after="120"/>
+              <w:spacing w:after="40"/>
             </w:pPr>
             <w:r>
               <w:rPr>
@@ -388,7 +389,7 @@
           </w:p>
           <w:p>
             <w:pPr>
-              <w:spacing w:after="120"/>
+              <w:spacing w:after="40"/>
             </w:pPr>
             <w:r>
               <w:rPr>
@@ -418,7 +419,7 @@
           </w:p>
           <w:p>
             <w:pPr>
-              <w:spacing w:after="120"/>
+              <w:spacing w:after="40"/>
             </w:pPr>
             <w:r>
               <w:rPr>
@@ -448,7 +449,7 @@
           </w:p>
           <w:p>
             <w:pPr>
-              <w:spacing w:after="120"/>
+              <w:spacing w:after="40"/>
             </w:pPr>
             <w:r>
               <w:rPr>
@@ -480,11 +481,11 @@
               <w:bottom w:w="100" w:type="dxa"/>
               <w:end w:w="100" w:type="dxa"/>
             </w:tcMar>
+            <w:vAlign w:val="top"/>
           </w:tcPr>
-          <w:p/>
           <w:p>
             <w:pPr>
-              <w:spacing w:after="200"/>
+              <w:spacing w:after="60"/>
               <w:jc w:val="center"/>
             </w:pPr>
             <w:r>
@@ -500,7 +501,7 @@
           </w:p>
           <w:p>
             <w:pPr>
-              <w:spacing w:after="120"/>
+              <w:spacing w:after="40"/>
               <w:jc w:val="center"/>
             </w:pPr>
             <w:r>
@@ -580,8 +581,8 @@
               <w:insideH w:val="nil"/>
               <w:insideV w:val="nil"/>
             </w:tcBorders>
+            <w:vAlign w:val="top"/>
           </w:tcPr>
-          <w:p/>
           <w:p>
             <w:pPr>
               <w:spacing w:after="0"/>
@@ -646,6 +647,7 @@
               <w:insideH w:val="nil"/>
               <w:insideV w:val="nil"/>
             </w:tcBorders>
+            <w:vAlign w:val="top"/>
           </w:tcPr>
           <w:p>
             <w:pPr>
@@ -1006,6 +1008,7 @@
               <w:insideH w:val="nil"/>
               <w:insideV w:val="nil"/>
             </w:tcBorders>
+            <w:vAlign w:val="top"/>
           </w:tcPr>
           <w:p>
             <w:pPr>
@@ -1143,8 +1146,8 @@
               <w:insideH w:val="nil"/>
               <w:insideV w:val="nil"/>
             </w:tcBorders>
+            <w:vAlign w:val="top"/>
           </w:tcPr>
-          <w:p/>
           <w:p>
             <w:pPr>
               <w:spacing w:after="0"/>
@@ -1209,6 +1212,7 @@
               <w:insideH w:val="nil"/>
               <w:insideV w:val="nil"/>
             </w:tcBorders>
+            <w:vAlign w:val="top"/>
           </w:tcPr>
           <w:p>
             <w:pPr>
@@ -1379,6 +1383,7 @@
               <w:insideH w:val="nil"/>
               <w:insideV w:val="nil"/>
             </w:tcBorders>
+            <w:vAlign w:val="top"/>
           </w:tcPr>
           <w:p>
             <w:pPr>
@@ -1426,8 +1431,8 @@
               <w:bottom w:w="160" w:type="dxa"/>
               <w:end w:w="160" w:type="dxa"/>
             </w:tcMar>
+            <w:vAlign w:val="top"/>
           </w:tcPr>
-          <w:p/>
           <w:p>
             <w:pPr>
               <w:spacing w:after="40"/>
@@ -1477,8 +1482,8 @@
               <w:bottom w:w="160" w:type="dxa"/>
               <w:end w:w="160" w:type="dxa"/>
             </w:tcMar>
+            <w:vAlign w:val="top"/>
           </w:tcPr>
-          <w:p/>
           <w:p>
             <w:pPr>
               <w:spacing w:after="40"/>
@@ -1530,8 +1535,8 @@
               <w:bottom w:w="160" w:type="dxa"/>
               <w:end w:w="160" w:type="dxa"/>
             </w:tcMar>
+            <w:vAlign w:val="top"/>
           </w:tcPr>
-          <w:p/>
           <w:p>
             <w:pPr>
               <w:spacing w:after="40"/>
@@ -1581,8 +1586,8 @@
               <w:bottom w:w="160" w:type="dxa"/>
               <w:end w:w="160" w:type="dxa"/>
             </w:tcMar>
+            <w:vAlign w:val="top"/>
           </w:tcPr>
-          <w:p/>
           <w:p>
             <w:pPr>
               <w:spacing w:after="40"/>
@@ -1668,8 +1673,8 @@
               <w:insideH w:val="nil"/>
               <w:insideV w:val="nil"/>
             </w:tcBorders>
+            <w:vAlign w:val="top"/>
           </w:tcPr>
-          <w:p/>
           <w:p>
             <w:pPr>
               <w:spacing w:after="0"/>
@@ -1734,6 +1739,7 @@
               <w:insideH w:val="nil"/>
               <w:insideV w:val="nil"/>
             </w:tcBorders>
+            <w:vAlign w:val="top"/>
           </w:tcPr>
           <w:p>
             <w:pPr>
@@ -1811,11 +1817,11 @@
               <w:bottom w:w="160" w:type="dxa"/>
               <w:end w:w="200" w:type="dxa"/>
             </w:tcMar>
+            <w:vAlign w:val="top"/>
           </w:tcPr>
-          <w:p/>
           <w:p>
             <w:pPr>
-              <w:spacing w:after="120"/>
+              <w:spacing w:after="40"/>
             </w:pPr>
             <w:r>
               <w:rPr>
@@ -1849,11 +1855,11 @@
               <w:bottom w:w="160" w:type="dxa"/>
               <w:end w:w="200" w:type="dxa"/>
             </w:tcMar>
+            <w:vAlign w:val="top"/>
           </w:tcPr>
-          <w:p/>
           <w:p>
             <w:pPr>
-              <w:spacing w:after="120"/>
+              <w:spacing w:after="40"/>
             </w:pPr>
             <w:r>
               <w:rPr>
@@ -1974,6 +1980,7 @@
               <w:insideH w:val="nil"/>
               <w:insideV w:val="nil"/>
             </w:tcBorders>
+            <w:vAlign w:val="top"/>
           </w:tcPr>
           <w:p>
             <w:pPr>
@@ -2010,7 +2017,11 @@
       <w:tblPr>
         <w:tblW w:type="auto" w:w="0"/>
         <w:jc w:val="center"/>
-        <w:tblLook w:firstColumn="1" w:firstRow="1" w:lastColumn="0" w:lastRow="0" w:noHBand="0" w:noVBand="1" w:val="04A0"/>
+        <w:tblBorders>
+          <w:insideH w:val="single" w:sz="2" w:space="0" w:color="D8E6EF"/>
+          <w:insideV w:val="nil"/>
+        </w:tblBorders>
+        <w:tblLook w:firstColumn="1" w:firstRow="0" w:lastColumn="0" w:lastRow="0" w:noHBand="0" w:noVBand="1" w:val="0020"/>
       </w:tblPr>
       <w:tblGrid>
         <w:gridCol w:w="3278"/>
@@ -2031,13 +2042,13 @@
             </w:tcBorders>
             <w:shd w:fill="F4F7F8"/>
             <w:tcMar>
-              <w:top w:w="140" w:type="dxa"/>
-              <w:start w:w="120" w:type="dxa"/>
-              <w:bottom w:w="140" w:type="dxa"/>
-              <w:end w:w="120" w:type="dxa"/>
+              <w:top w:w="120" w:type="dxa"/>
+              <w:start w:w="100" w:type="dxa"/>
+              <w:bottom w:w="120" w:type="dxa"/>
+              <w:end w:w="100" w:type="dxa"/>
             </w:tcMar>
+            <w:vAlign w:val="top"/>
           </w:tcPr>
-          <w:p/>
           <w:p>
             <w:pPr>
               <w:spacing w:after="40"/>
@@ -2047,26 +2058,24 @@
               <w:rPr>
                 <w:rFonts w:ascii="Open Sans" w:hAnsi="Open Sans" w:eastAsia="Open Sans"/>
                 <w:b/>
-                <w:i w:val="0"/>
                 <w:color w:val="006C9B"/>
                 <w:sz w:val="20"/>
               </w:rPr>
-              <w:t>Progress</w:t>
+              <w:t>PROGRESS PHOTOS</w:t>
             </w:r>
           </w:p>
           <w:p>
             <w:pPr>
+              <w:spacing w:after="60"/>
               <w:jc w:val="center"/>
             </w:pPr>
             <w:r>
               <w:rPr>
                 <w:rFonts w:ascii="Open Sans" w:hAnsi="Open Sans" w:eastAsia="Open Sans"/>
-                <w:b w:val="0"/>
-                <w:i w:val="0"/>
-                <w:color w:val="2B2B2B"/>
+                <w:color w:val="4A4A4A"/>
                 <w:sz w:val="16"/>
               </w:rPr>
-              <w:t>Live updates and photos.</w:t>
+              <w:t>Weekly site updates</w:t>
             </w:r>
           </w:p>
         </w:tc>
@@ -2083,13 +2092,13 @@
             </w:tcBorders>
             <w:shd w:fill="F4F7F8"/>
             <w:tcMar>
-              <w:top w:w="140" w:type="dxa"/>
-              <w:start w:w="120" w:type="dxa"/>
-              <w:bottom w:w="140" w:type="dxa"/>
-              <w:end w:w="120" w:type="dxa"/>
+              <w:top w:w="120" w:type="dxa"/>
+              <w:start w:w="100" w:type="dxa"/>
+              <w:bottom w:w="120" w:type="dxa"/>
+              <w:end w:w="100" w:type="dxa"/>
             </w:tcMar>
+            <w:vAlign w:val="top"/>
           </w:tcPr>
-          <w:p/>
           <w:p>
             <w:pPr>
               <w:spacing w:after="40"/>
@@ -2099,26 +2108,24 @@
               <w:rPr>
                 <w:rFonts w:ascii="Open Sans" w:hAnsi="Open Sans" w:eastAsia="Open Sans"/>
                 <w:b/>
-                <w:i w:val="0"/>
                 <w:color w:val="006C9B"/>
                 <w:sz w:val="20"/>
               </w:rPr>
-              <w:t>Selections</w:t>
+              <w:t>LIVE SCHEDULE</w:t>
             </w:r>
           </w:p>
           <w:p>
             <w:pPr>
+              <w:spacing w:after="60"/>
               <w:jc w:val="center"/>
             </w:pPr>
             <w:r>
               <w:rPr>
                 <w:rFonts w:ascii="Open Sans" w:hAnsi="Open Sans" w:eastAsia="Open Sans"/>
-                <w:b w:val="0"/>
-                <w:i w:val="0"/>
-                <w:color w:val="2B2B2B"/>
+                <w:color w:val="4A4A4A"/>
                 <w:sz w:val="16"/>
               </w:rPr>
-              <w:t>Decisions captured clearly.</w:t>
+              <w:t>Track upcoming milestones</w:t>
             </w:r>
           </w:p>
         </w:tc>
@@ -2135,13 +2142,13 @@
             </w:tcBorders>
             <w:shd w:fill="F4F7F8"/>
             <w:tcMar>
-              <w:top w:w="140" w:type="dxa"/>
-              <w:start w:w="120" w:type="dxa"/>
-              <w:bottom w:w="140" w:type="dxa"/>
-              <w:end w:w="120" w:type="dxa"/>
+              <w:top w:w="120" w:type="dxa"/>
+              <w:start w:w="100" w:type="dxa"/>
+              <w:bottom w:w="120" w:type="dxa"/>
+              <w:end w:w="100" w:type="dxa"/>
             </w:tcMar>
+            <w:vAlign w:val="top"/>
           </w:tcPr>
-          <w:p/>
           <w:p>
             <w:pPr>
               <w:spacing w:after="40"/>
@@ -2151,26 +2158,550 @@
               <w:rPr>
                 <w:rFonts w:ascii="Open Sans" w:hAnsi="Open Sans" w:eastAsia="Open Sans"/>
                 <w:b/>
-                <w:i w:val="0"/>
                 <w:color w:val="006C9B"/>
                 <w:sz w:val="20"/>
               </w:rPr>
-              <w:t>Variations</w:t>
+              <w:t>SELECTIONS</w:t>
             </w:r>
           </w:p>
           <w:p>
             <w:pPr>
+              <w:spacing w:after="60"/>
               <w:jc w:val="center"/>
             </w:pPr>
             <w:r>
               <w:rPr>
                 <w:rFonts w:ascii="Open Sans" w:hAnsi="Open Sans" w:eastAsia="Open Sans"/>
-                <w:b w:val="0"/>
-                <w:i w:val="0"/>
-                <w:color w:val="2B2B2B"/>
+                <w:color w:val="4A4A4A"/>
                 <w:sz w:val="16"/>
               </w:rPr>
-              <w:t>No hidden surprises.</w:t>
+              <w:t>Approve finishes and fixtures</w:t>
+            </w:r>
+          </w:p>
+        </w:tc>
+      </w:tr>
+      <w:tr>
+        <w:tc>
+          <w:tcPr>
+            <w:tcW w:type="dxa" w:w="3278"/>
+            <w:tcBorders>
+              <w:top w:val="nil"/>
+              <w:left w:val="nil"/>
+              <w:bottom w:val="nil"/>
+              <w:right w:val="nil"/>
+              <w:insideH w:val="nil"/>
+              <w:insideV w:val="nil"/>
+            </w:tcBorders>
+            <w:shd w:fill="F4F7F8"/>
+            <w:tcMar>
+              <w:top w:w="120" w:type="dxa"/>
+              <w:start w:w="100" w:type="dxa"/>
+              <w:bottom w:w="120" w:type="dxa"/>
+              <w:end w:w="100" w:type="dxa"/>
+            </w:tcMar>
+            <w:vAlign w:val="top"/>
+          </w:tcPr>
+          <w:p>
+            <w:pPr>
+              <w:spacing w:after="40"/>
+              <w:jc w:val="center"/>
+            </w:pPr>
+            <w:r>
+              <w:rPr>
+                <w:rFonts w:ascii="Open Sans" w:hAnsi="Open Sans" w:eastAsia="Open Sans"/>
+                <w:b/>
+                <w:color w:val="006C9B"/>
+                <w:sz w:val="20"/>
+              </w:rPr>
+              <w:t>VARIATIONS</w:t>
+            </w:r>
+          </w:p>
+          <w:p>
+            <w:pPr>
+              <w:spacing w:after="60"/>
+              <w:jc w:val="center"/>
+            </w:pPr>
+            <w:r>
+              <w:rPr>
+                <w:rFonts w:ascii="Open Sans" w:hAnsi="Open Sans" w:eastAsia="Open Sans"/>
+                <w:color w:val="4A4A4A"/>
+                <w:sz w:val="16"/>
+              </w:rPr>
+              <w:t>Review and sign scope changes</w:t>
+            </w:r>
+          </w:p>
+        </w:tc>
+        <w:tc>
+          <w:tcPr>
+            <w:tcW w:type="dxa" w:w="3278"/>
+            <w:tcBorders>
+              <w:top w:val="nil"/>
+              <w:left w:val="nil"/>
+              <w:bottom w:val="nil"/>
+              <w:right w:val="nil"/>
+              <w:insideH w:val="nil"/>
+              <w:insideV w:val="nil"/>
+            </w:tcBorders>
+            <w:shd w:fill="F4F7F8"/>
+            <w:tcMar>
+              <w:top w:w="120" w:type="dxa"/>
+              <w:start w:w="100" w:type="dxa"/>
+              <w:bottom w:w="120" w:type="dxa"/>
+              <w:end w:w="100" w:type="dxa"/>
+            </w:tcMar>
+            <w:vAlign w:val="top"/>
+          </w:tcPr>
+          <w:p>
+            <w:pPr>
+              <w:spacing w:after="40"/>
+              <w:jc w:val="center"/>
+            </w:pPr>
+            <w:r>
+              <w:rPr>
+                <w:rFonts w:ascii="Open Sans" w:hAnsi="Open Sans" w:eastAsia="Open Sans"/>
+                <w:b/>
+                <w:color w:val="006C9B"/>
+                <w:sz w:val="20"/>
+              </w:rPr>
+              <w:t>DOCUMENTS</w:t>
+            </w:r>
+          </w:p>
+          <w:p>
+            <w:pPr>
+              <w:spacing w:after="60"/>
+              <w:jc w:val="center"/>
+            </w:pPr>
+            <w:r>
+              <w:rPr>
+                <w:rFonts w:ascii="Open Sans" w:hAnsi="Open Sans" w:eastAsia="Open Sans"/>
+                <w:color w:val="4A4A4A"/>
+                <w:sz w:val="16"/>
+              </w:rPr>
+              <w:t>Contracts, plans and certificates</w:t>
+            </w:r>
+          </w:p>
+        </w:tc>
+        <w:tc>
+          <w:tcPr>
+            <w:tcW w:type="dxa" w:w="3278"/>
+            <w:tcBorders>
+              <w:top w:val="nil"/>
+              <w:left w:val="nil"/>
+              <w:bottom w:val="nil"/>
+              <w:right w:val="nil"/>
+              <w:insideH w:val="nil"/>
+              <w:insideV w:val="nil"/>
+            </w:tcBorders>
+            <w:shd w:fill="F4F7F8"/>
+            <w:tcMar>
+              <w:top w:w="120" w:type="dxa"/>
+              <w:start w:w="100" w:type="dxa"/>
+              <w:bottom w:w="120" w:type="dxa"/>
+              <w:end w:w="100" w:type="dxa"/>
+            </w:tcMar>
+            <w:vAlign w:val="top"/>
+          </w:tcPr>
+          <w:p>
+            <w:pPr>
+              <w:spacing w:after="40"/>
+              <w:jc w:val="center"/>
+            </w:pPr>
+            <w:r>
+              <w:rPr>
+                <w:rFonts w:ascii="Open Sans" w:hAnsi="Open Sans" w:eastAsia="Open Sans"/>
+                <w:b/>
+                <w:color w:val="006C9B"/>
+                <w:sz w:val="20"/>
+              </w:rPr>
+              <w:t>MEETINGS</w:t>
+            </w:r>
+          </w:p>
+          <w:p>
+            <w:pPr>
+              <w:spacing w:after="60"/>
+              <w:jc w:val="center"/>
+            </w:pPr>
+            <w:r>
+              <w:rPr>
+                <w:rFonts w:ascii="Open Sans" w:hAnsi="Open Sans" w:eastAsia="Open Sans"/>
+                <w:color w:val="4A4A4A"/>
+                <w:sz w:val="16"/>
+              </w:rPr>
+              <w:t>Book and manage site meetings</w:t>
+            </w:r>
+          </w:p>
+        </w:tc>
+      </w:tr>
+    </w:tbl>
+    <w:p>
+      <w:pPr>
+        <w:spacing w:before="200" w:after="80"/>
+      </w:pPr>
+      <w:r>
+        <w:rPr>
+          <w:rFonts w:ascii="Open Sans" w:hAnsi="Open Sans" w:eastAsia="Open Sans"/>
+          <w:b/>
+          <w:color w:val="2B2B2B"/>
+          <w:sz w:val="19"/>
+        </w:rPr>
+        <w:t>What you can do in the portal:</w:t>
+      </w:r>
+    </w:p>
+    <w:tbl>
+      <w:tblPr>
+        <w:tblW w:type="auto" w:w="0"/>
+        <w:jc w:val="center"/>
+        <w:tblBorders>
+          <w:top w:val="nil"/>
+          <w:left w:val="nil"/>
+          <w:bottom w:val="nil"/>
+          <w:right w:val="nil"/>
+          <w:insideH w:val="nil"/>
+          <w:insideV w:val="nil"/>
+        </w:tblBorders>
+      </w:tblPr>
+      <w:tblGrid>
+        <w:gridCol w:w="4917"/>
+        <w:gridCol w:w="4917"/>
+      </w:tblGrid>
+      <w:tr>
+        <w:tc>
+          <w:tcPr>
+            <w:tcW w:type="dxa" w:w="4917"/>
+            <w:tcBorders>
+              <w:top w:val="nil"/>
+              <w:left w:val="nil"/>
+              <w:bottom w:val="nil"/>
+              <w:right w:val="nil"/>
+            </w:tcBorders>
+            <w:vAlign w:val="top"/>
+          </w:tcPr>
+          <w:p>
+            <w:pPr>
+              <w:spacing w:before="0" w:after="60"/>
+            </w:pPr>
+            <w:r>
+              <w:rPr>
+                <w:rFonts w:ascii="Open Sans" w:hAnsi="Open Sans" w:eastAsia="Open Sans"/>
+                <w:b/>
+                <w:color w:val="006C9B"/>
+                <w:sz w:val="17"/>
+              </w:rPr>
+              <w:t xml:space="preserve">✓ </w:t>
+            </w:r>
+            <w:r>
+              <w:rPr>
+                <w:rFonts w:ascii="Open Sans" w:hAnsi="Open Sans" w:eastAsia="Open Sans"/>
+                <w:color w:val="2B2B2B"/>
+                <w:sz w:val="17"/>
+              </w:rPr>
+              <w:t>View weekly site updates</w:t>
+            </w:r>
+          </w:p>
+        </w:tc>
+        <w:tc>
+          <w:tcPr>
+            <w:tcW w:type="dxa" w:w="4917"/>
+            <w:tcBorders>
+              <w:top w:val="nil"/>
+              <w:left w:val="nil"/>
+              <w:bottom w:val="nil"/>
+              <w:right w:val="nil"/>
+            </w:tcBorders>
+            <w:vAlign w:val="top"/>
+          </w:tcPr>
+          <w:p>
+            <w:pPr>
+              <w:spacing w:before="0" w:after="60"/>
+            </w:pPr>
+            <w:r>
+              <w:rPr>
+                <w:rFonts w:ascii="Open Sans" w:hAnsi="Open Sans" w:eastAsia="Open Sans"/>
+                <w:b/>
+                <w:color w:val="006C9B"/>
+                <w:sz w:val="17"/>
+              </w:rPr>
+              <w:t xml:space="preserve">✓ </w:t>
+            </w:r>
+            <w:r>
+              <w:rPr>
+                <w:rFonts w:ascii="Open Sans" w:hAnsi="Open Sans" w:eastAsia="Open Sans"/>
+                <w:color w:val="2B2B2B"/>
+                <w:sz w:val="17"/>
+              </w:rPr>
+              <w:t>Approve selections and finishes</w:t>
+            </w:r>
+          </w:p>
+        </w:tc>
+      </w:tr>
+      <w:tr>
+        <w:tc>
+          <w:tcPr>
+            <w:tcW w:type="dxa" w:w="4917"/>
+            <w:tcBorders>
+              <w:top w:val="nil"/>
+              <w:left w:val="nil"/>
+              <w:bottom w:val="nil"/>
+              <w:right w:val="nil"/>
+            </w:tcBorders>
+            <w:vAlign w:val="top"/>
+          </w:tcPr>
+          <w:p>
+            <w:pPr>
+              <w:spacing w:before="0" w:after="60"/>
+            </w:pPr>
+            <w:r>
+              <w:rPr>
+                <w:rFonts w:ascii="Open Sans" w:hAnsi="Open Sans" w:eastAsia="Open Sans"/>
+                <w:b/>
+                <w:color w:val="006C9B"/>
+                <w:sz w:val="17"/>
+              </w:rPr>
+              <w:t xml:space="preserve">✓ </w:t>
+            </w:r>
+            <w:r>
+              <w:rPr>
+                <w:rFonts w:ascii="Open Sans" w:hAnsi="Open Sans" w:eastAsia="Open Sans"/>
+                <w:color w:val="2B2B2B"/>
+                <w:sz w:val="17"/>
+              </w:rPr>
+              <w:t>Review progress photos</w:t>
+            </w:r>
+          </w:p>
+        </w:tc>
+        <w:tc>
+          <w:tcPr>
+            <w:tcW w:type="dxa" w:w="4917"/>
+            <w:tcBorders>
+              <w:top w:val="nil"/>
+              <w:left w:val="nil"/>
+              <w:bottom w:val="nil"/>
+              <w:right w:val="nil"/>
+            </w:tcBorders>
+            <w:vAlign w:val="top"/>
+          </w:tcPr>
+          <w:p>
+            <w:pPr>
+              <w:spacing w:before="0" w:after="60"/>
+            </w:pPr>
+            <w:r>
+              <w:rPr>
+                <w:rFonts w:ascii="Open Sans" w:hAnsi="Open Sans" w:eastAsia="Open Sans"/>
+                <w:b/>
+                <w:color w:val="006C9B"/>
+                <w:sz w:val="17"/>
+              </w:rPr>
+              <w:t xml:space="preserve">✓ </w:t>
+            </w:r>
+            <w:r>
+              <w:rPr>
+                <w:rFonts w:ascii="Open Sans" w:hAnsi="Open Sans" w:eastAsia="Open Sans"/>
+                <w:color w:val="2B2B2B"/>
+                <w:sz w:val="17"/>
+              </w:rPr>
+              <w:t>Sign off on variations digitally</w:t>
+            </w:r>
+          </w:p>
+        </w:tc>
+      </w:tr>
+      <w:tr>
+        <w:tc>
+          <w:tcPr>
+            <w:tcW w:type="dxa" w:w="4917"/>
+            <w:tcBorders>
+              <w:top w:val="nil"/>
+              <w:left w:val="nil"/>
+              <w:bottom w:val="nil"/>
+              <w:right w:val="nil"/>
+            </w:tcBorders>
+            <w:vAlign w:val="top"/>
+          </w:tcPr>
+          <w:p>
+            <w:pPr>
+              <w:spacing w:before="0" w:after="60"/>
+            </w:pPr>
+            <w:r>
+              <w:rPr>
+                <w:rFonts w:ascii="Open Sans" w:hAnsi="Open Sans" w:eastAsia="Open Sans"/>
+                <w:b/>
+                <w:color w:val="006C9B"/>
+                <w:sz w:val="17"/>
+              </w:rPr>
+              <w:t xml:space="preserve">✓ </w:t>
+            </w:r>
+            <w:r>
+              <w:rPr>
+                <w:rFonts w:ascii="Open Sans" w:hAnsi="Open Sans" w:eastAsia="Open Sans"/>
+                <w:color w:val="2B2B2B"/>
+                <w:sz w:val="17"/>
+              </w:rPr>
+              <w:t>Track budget changes in real time</w:t>
+            </w:r>
+          </w:p>
+        </w:tc>
+        <w:tc>
+          <w:tcPr>
+            <w:tcW w:type="dxa" w:w="4917"/>
+            <w:tcBorders>
+              <w:top w:val="nil"/>
+              <w:left w:val="nil"/>
+              <w:bottom w:val="nil"/>
+              <w:right w:val="nil"/>
+            </w:tcBorders>
+            <w:vAlign w:val="top"/>
+          </w:tcPr>
+          <w:p>
+            <w:pPr>
+              <w:spacing w:before="0" w:after="60"/>
+            </w:pPr>
+            <w:r>
+              <w:rPr>
+                <w:rFonts w:ascii="Open Sans" w:hAnsi="Open Sans" w:eastAsia="Open Sans"/>
+                <w:b/>
+                <w:color w:val="006C9B"/>
+                <w:sz w:val="17"/>
+              </w:rPr>
+              <w:t xml:space="preserve">✓ </w:t>
+            </w:r>
+            <w:r>
+              <w:rPr>
+                <w:rFonts w:ascii="Open Sans" w:hAnsi="Open Sans" w:eastAsia="Open Sans"/>
+                <w:color w:val="2B2B2B"/>
+                <w:sz w:val="17"/>
+              </w:rPr>
+              <w:t>Access plans, contracts and certificates</w:t>
+            </w:r>
+          </w:p>
+        </w:tc>
+      </w:tr>
+      <w:tr>
+        <w:tc>
+          <w:tcPr>
+            <w:tcW w:type="dxa" w:w="4917"/>
+            <w:tcBorders>
+              <w:top w:val="nil"/>
+              <w:left w:val="nil"/>
+              <w:bottom w:val="nil"/>
+              <w:right w:val="nil"/>
+            </w:tcBorders>
+            <w:vAlign w:val="top"/>
+          </w:tcPr>
+          <w:p>
+            <w:pPr>
+              <w:spacing w:before="0" w:after="60"/>
+            </w:pPr>
+            <w:r>
+              <w:rPr>
+                <w:rFonts w:ascii="Open Sans" w:hAnsi="Open Sans" w:eastAsia="Open Sans"/>
+                <w:b/>
+                <w:color w:val="006C9B"/>
+                <w:sz w:val="17"/>
+              </w:rPr>
+              <w:t xml:space="preserve">✓ </w:t>
+            </w:r>
+            <w:r>
+              <w:rPr>
+                <w:rFonts w:ascii="Open Sans" w:hAnsi="Open Sans" w:eastAsia="Open Sans"/>
+                <w:color w:val="2B2B2B"/>
+                <w:sz w:val="17"/>
+              </w:rPr>
+              <w:t>Book and manage site meetings</w:t>
+            </w:r>
+          </w:p>
+        </w:tc>
+        <w:tc>
+          <w:tcPr>
+            <w:tcW w:type="dxa" w:w="4917"/>
+            <w:tcBorders>
+              <w:top w:val="nil"/>
+              <w:left w:val="nil"/>
+              <w:bottom w:val="nil"/>
+              <w:right w:val="nil"/>
+            </w:tcBorders>
+            <w:vAlign w:val="top"/>
+          </w:tcPr>
+          <w:p>
+            <w:pPr>
+              <w:spacing w:before="0" w:after="60"/>
+            </w:pPr>
+            <w:r>
+              <w:rPr>
+                <w:rFonts w:ascii="Open Sans" w:hAnsi="Open Sans" w:eastAsia="Open Sans"/>
+                <w:b/>
+                <w:color w:val="006C9B"/>
+                <w:sz w:val="17"/>
+              </w:rPr>
+              <w:t xml:space="preserve">✓ </w:t>
+            </w:r>
+            <w:r>
+              <w:rPr>
+                <w:rFonts w:ascii="Open Sans" w:hAnsi="Open Sans" w:eastAsia="Open Sans"/>
+                <w:color w:val="2B2B2B"/>
+                <w:sz w:val="17"/>
+              </w:rPr>
+              <w:t>Communicate directly with the Blue Leaf team</w:t>
+            </w:r>
+          </w:p>
+        </w:tc>
+      </w:tr>
+    </w:tbl>
+    <w:p>
+      <w:pPr>
+        <w:spacing w:before="160" w:after="80"/>
+      </w:pPr>
+    </w:p>
+    <w:tbl>
+      <w:tblPr>
+        <w:tblW w:type="auto" w:w="0"/>
+        <w:jc w:val="center"/>
+        <w:tblBorders>
+          <w:top w:val="single" w:sz="6" w:space="0" w:color="006C9B"/>
+          <w:left w:val="single" w:sz="6" w:space="0" w:color="006C9B"/>
+          <w:bottom w:val="single" w:sz="6" w:space="0" w:color="006C9B"/>
+          <w:right w:val="single" w:sz="6" w:space="0" w:color="006C9B"/>
+        </w:tblBorders>
+      </w:tblPr>
+      <w:tblGrid>
+        <w:gridCol w:w="9835"/>
+      </w:tblGrid>
+      <w:tr>
+        <w:trPr>
+          <w:trHeight w:val="1700" w:hRule="atLeast"/>
+        </w:trPr>
+        <w:tc>
+          <w:tcPr>
+            <w:tcW w:type="dxa" w:w="9835"/>
+            <w:shd w:fill="EBF3F8"/>
+            <w:vAlign w:val="center"/>
+          </w:tcPr>
+          <w:p>
+            <w:pPr>
+              <w:spacing w:before="120" w:after="60"/>
+              <w:jc w:val="center"/>
+            </w:pPr>
+            <w:r>
+              <w:rPr>
+                <w:rFonts w:ascii="Open Sans" w:hAnsi="Open Sans" w:eastAsia="Open Sans"/>
+                <w:b/>
+                <w:color w:val="006C9B"/>
+                <w:sz w:val="24"/>
+              </w:rPr>
+              <w:t>Blue Leaf Client Portal</w:t>
+            </w:r>
+          </w:p>
+          <w:p>
+            <w:pPr>
+              <w:spacing w:before="0" w:after="40"/>
+              <w:jc w:val="center"/>
+            </w:pPr>
+            <w:r>
+              <w:rPr>
+                <w:rFonts w:ascii="Open Sans" w:hAnsi="Open Sans" w:eastAsia="Open Sans"/>
+                <w:i/>
+                <w:color w:val="6B6B6B"/>
+                <w:sz w:val="16"/>
+              </w:rPr>
+              <w:t>[ Replace with portal screenshot before sending ]</w:t>
             </w:r>
           </w:p>
         </w:tc>
@@ -2210,8 +2741,8 @@
               <w:insideH w:val="nil"/>
               <w:insideV w:val="nil"/>
             </w:tcBorders>
+            <w:vAlign w:val="top"/>
           </w:tcPr>
-          <w:p/>
           <w:p>
             <w:pPr>
               <w:spacing w:after="0"/>
@@ -2276,6 +2807,7 @@
               <w:insideH w:val="nil"/>
               <w:insideV w:val="nil"/>
             </w:tcBorders>
+            <w:vAlign w:val="top"/>
           </w:tcPr>
           <w:p>
             <w:pPr>
@@ -2488,6 +3020,7 @@
               <w:insideH w:val="nil"/>
               <w:insideV w:val="nil"/>
             </w:tcBorders>
+            <w:vAlign w:val="top"/>
           </w:tcPr>
           <w:p>
             <w:pPr>
@@ -2520,21 +3053,6 @@
         <w:t>The following allowances are included for items not yet fully selected or confirmed. Any adjustment is treated as a variation.</w:t>
       </w:r>
     </w:p>
-    <w:p>
-      <w:pPr>
-        <w:spacing w:after="120"/>
-      </w:pPr>
-      <w:r>
-        <w:rPr>
-          <w:rFonts w:ascii="Open Sans" w:hAnsi="Open Sans" w:eastAsia="Open Sans"/>
-          <w:b w:val="0"/>
-          <w:i w:val="0"/>
-          <w:color w:val="FFFFFF"/>
-          <w:sz w:val="2"/>
-        </w:rPr>
-        <w:t>{#PC_SUMS}</w:t>
-      </w:r>
-    </w:p>
     <w:tbl>
       <w:tblPr>
         <w:tblW w:type="auto" w:w="0"/>
@@ -2547,35 +3065,6 @@
         <w:gridCol w:w="2448"/>
       </w:tblGrid>
       <w:tr>
-        <w:trPr>
-          <w:tblHeader w:val="true"/>
-        </w:trPr>
-        <w:tc>
-          <w:tcPr>
-            <w:tcW w:type="dxa" w:w="4917"/>
-            <w:shd w:fill="006C9B"/>
-            <w:tcMar>
-              <w:top w:w="100" w:type="dxa"/>
-              <w:start w:w="120" w:type="dxa"/>
-              <w:bottom w:w="100" w:type="dxa"/>
-              <w:end w:w="120" w:type="dxa"/>
-            </w:tcMar>
-          </w:tcPr>
-        </w:tc>
-        <w:tc>
-          <w:tcPr>
-            <w:tcW w:type="dxa" w:w="4917"/>
-            <w:shd w:fill="006C9B"/>
-            <w:tcMar>
-              <w:top w:w="100" w:type="dxa"/>
-              <w:start w:w="120" w:type="dxa"/>
-              <w:bottom w:w="100" w:type="dxa"/>
-              <w:end w:w="120" w:type="dxa"/>
-            </w:tcMar>
-          </w:tcPr>
-        </w:tc>
-      </w:tr>
-      <w:tr>
         <w:tc>
           <w:tcPr>
             <w:tcW w:type="dxa" w:w="4917"/>
@@ -2586,11 +3075,11 @@
               <w:bottom w:w="100" w:type="dxa"/>
               <w:end w:w="120" w:type="dxa"/>
             </w:tcMar>
+            <w:vAlign w:val="top"/>
           </w:tcPr>
-          <w:p/>
           <w:p>
             <w:pPr>
-              <w:spacing w:after="120"/>
+              <w:spacing w:after="40"/>
             </w:pPr>
             <w:r>
               <w:rPr>
@@ -2600,7 +3089,7 @@
                 <w:color w:val="2B2B2B"/>
                 <w:sz w:val="19"/>
               </w:rPr>
-              <w:t>{PC_DESCRIPTION}</w:t>
+              <w:t>{#PC_SUMS}{PC_DESCRIPTION}</w:t>
             </w:r>
           </w:p>
         </w:tc>
@@ -2614,11 +3103,11 @@
               <w:bottom w:w="100" w:type="dxa"/>
               <w:end w:w="120" w:type="dxa"/>
             </w:tcMar>
+            <w:vAlign w:val="top"/>
           </w:tcPr>
-          <w:p/>
           <w:p>
             <w:pPr>
-              <w:spacing w:after="120"/>
+              <w:spacing w:after="40"/>
             </w:pPr>
             <w:r>
               <w:rPr>
@@ -2628,27 +3117,12 @@
                 <w:color w:val="2B2B2B"/>
                 <w:sz w:val="19"/>
               </w:rPr>
-              <w:t>{PC_AMOUNT}</w:t>
+              <w:t>{PC_AMOUNT}{/PC_SUMS}</w:t>
             </w:r>
           </w:p>
         </w:tc>
       </w:tr>
     </w:tbl>
-    <w:p>
-      <w:pPr>
-        <w:spacing w:after="120"/>
-      </w:pPr>
-      <w:r>
-        <w:rPr>
-          <w:rFonts w:ascii="Open Sans" w:hAnsi="Open Sans" w:eastAsia="Open Sans"/>
-          <w:b w:val="0"/>
-          <w:i w:val="0"/>
-          <w:color w:val="FFFFFF"/>
-          <w:sz w:val="2"/>
-        </w:rPr>
-        <w:t>{/PC_SUMS}</w:t>
-      </w:r>
-    </w:p>
     <w:p>
       <w:r/>
     </w:p>
@@ -2681,8 +3155,8 @@
               <w:insideH w:val="nil"/>
               <w:insideV w:val="nil"/>
             </w:tcBorders>
+            <w:vAlign w:val="top"/>
           </w:tcPr>
-          <w:p/>
           <w:p>
             <w:pPr>
               <w:spacing w:after="0"/>
@@ -2747,6 +3221,7 @@
               <w:insideH w:val="nil"/>
               <w:insideV w:val="nil"/>
             </w:tcBorders>
+            <w:vAlign w:val="top"/>
           </w:tcPr>
           <w:p>
             <w:pPr>
@@ -2824,11 +3299,11 @@
               <w:bottom w:w="160" w:type="dxa"/>
               <w:end w:w="160" w:type="dxa"/>
             </w:tcMar>
+            <w:vAlign w:val="top"/>
           </w:tcPr>
-          <w:p/>
           <w:p>
             <w:pPr>
-              <w:spacing w:after="120"/>
+              <w:spacing w:after="40"/>
             </w:pPr>
             <w:r>
               <w:rPr>
@@ -2860,11 +3335,11 @@
               <w:bottom w:w="160" w:type="dxa"/>
               <w:end w:w="160" w:type="dxa"/>
             </w:tcMar>
+            <w:vAlign w:val="top"/>
           </w:tcPr>
-          <w:p/>
           <w:p>
             <w:pPr>
-              <w:spacing w:after="120"/>
+              <w:spacing w:after="40"/>
             </w:pPr>
             <w:r>
               <w:rPr>
@@ -2985,6 +3460,7 @@
               <w:insideH w:val="nil"/>
               <w:insideV w:val="nil"/>
             </w:tcBorders>
+            <w:vAlign w:val="top"/>
           </w:tcPr>
           <w:p>
             <w:pPr>
@@ -3094,11 +3570,11 @@
               <w:bottom w:w="100" w:type="dxa"/>
               <w:end w:w="120" w:type="dxa"/>
             </w:tcMar>
+            <w:vAlign w:val="top"/>
           </w:tcPr>
-          <w:p/>
           <w:p>
             <w:pPr>
-              <w:spacing w:after="120"/>
+              <w:spacing w:after="40"/>
             </w:pPr>
             <w:r>
               <w:rPr>
@@ -3130,11 +3606,11 @@
               <w:bottom w:w="100" w:type="dxa"/>
               <w:end w:w="120" w:type="dxa"/>
             </w:tcMar>
+            <w:vAlign w:val="top"/>
           </w:tcPr>
-          <w:p/>
           <w:p>
             <w:pPr>
-              <w:spacing w:after="120"/>
+              <w:spacing w:after="40"/>
             </w:pPr>
             <w:r>
               <w:rPr>
@@ -3168,11 +3644,11 @@
               <w:bottom w:w="100" w:type="dxa"/>
               <w:end w:w="120" w:type="dxa"/>
             </w:tcMar>
+            <w:vAlign w:val="top"/>
           </w:tcPr>
-          <w:p/>
           <w:p>
             <w:pPr>
-              <w:spacing w:after="120"/>
+              <w:spacing w:after="40"/>
             </w:pPr>
             <w:r>
               <w:rPr>
@@ -3202,7 +3678,7 @@
           </w:p>
           <w:p>
             <w:pPr>
-              <w:spacing w:after="120"/>
+              <w:spacing w:after="40"/>
             </w:pPr>
             <w:r>
               <w:rPr>
@@ -3234,8 +3710,8 @@
               <w:bottom w:w="100" w:type="dxa"/>
               <w:end w:w="120" w:type="dxa"/>
             </w:tcMar>
+            <w:vAlign w:val="top"/>
           </w:tcPr>
-          <w:p/>
           <w:p>
             <w:pPr>
               <w:spacing w:after="0"/>
@@ -3254,7 +3730,7 @@
           </w:p>
           <w:p>
             <w:pPr>
-              <w:spacing w:after="120"/>
+              <w:spacing w:after="40"/>
             </w:pPr>
             <w:r>
               <w:rPr>
@@ -3285,7 +3761,7 @@
           </w:p>
           <w:p>
             <w:pPr>
-              <w:spacing w:after="120"/>
+              <w:spacing w:after="40"/>
             </w:pPr>
             <w:r>
               <w:rPr>
@@ -3348,8 +3824,8 @@
               <w:insideH w:val="nil"/>
               <w:insideV w:val="nil"/>
             </w:tcBorders>
+            <w:vAlign w:val="top"/>
           </w:tcPr>
-          <w:p/>
           <w:p>
             <w:pPr>
               <w:spacing w:after="0"/>
@@ -3414,6 +3890,7 @@
               <w:insideH w:val="nil"/>
               <w:insideV w:val="nil"/>
             </w:tcBorders>
+            <w:vAlign w:val="top"/>
           </w:tcPr>
           <w:p>
             <w:pPr>
@@ -3474,8 +3951,8 @@
               <w:bottom w:w="280" w:type="dxa"/>
               <w:end w:w="280" w:type="dxa"/>
             </w:tcMar>
+            <w:vAlign w:val="top"/>
           </w:tcPr>
-          <w:p/>
           <w:p>
             <w:pPr>
               <w:spacing w:after="0"/>
@@ -3494,7 +3971,7 @@
           </w:p>
           <w:p>
             <w:pPr>
-              <w:spacing w:after="120"/>
+              <w:spacing w:after="40"/>
             </w:pPr>
             <w:r>
               <w:rPr>
@@ -3509,7 +3986,7 @@
           </w:p>
           <w:p>
             <w:pPr>
-              <w:spacing w:after="120"/>
+              <w:spacing w:after="40"/>
             </w:pPr>
             <w:r>
               <w:rPr>
@@ -3628,6 +4105,7 @@
               <w:insideH w:val="nil"/>
               <w:insideV w:val="nil"/>
             </w:tcBorders>
+            <w:vAlign w:val="top"/>
           </w:tcPr>
           <w:p>
             <w:pPr>
@@ -3703,11 +4181,11 @@
               <w:bottom w:w="150" w:type="dxa"/>
               <w:end w:w="180" w:type="dxa"/>
             </w:tcMar>
+            <w:vAlign w:val="top"/>
           </w:tcPr>
-          <w:p/>
           <w:p>
             <w:pPr>
-              <w:spacing w:after="120"/>
+              <w:spacing w:after="40"/>
             </w:pPr>
             <w:r>
               <w:rPr>
@@ -3770,8 +4248,8 @@
               <w:insideH w:val="nil"/>
               <w:insideV w:val="nil"/>
             </w:tcBorders>
+            <w:vAlign w:val="top"/>
           </w:tcPr>
-          <w:p/>
           <w:p>
             <w:pPr>
               <w:spacing w:after="0"/>
@@ -3836,6 +4314,7 @@
               <w:insideH w:val="nil"/>
               <w:insideV w:val="nil"/>
             </w:tcBorders>
+            <w:vAlign w:val="top"/>
           </w:tcPr>
           <w:p>
             <w:pPr>
@@ -3883,8 +4362,8 @@
               <w:bottom w:w="120" w:type="dxa"/>
               <w:end w:w="140" w:type="dxa"/>
             </w:tcMar>
+            <w:vAlign w:val="top"/>
           </w:tcPr>
-          <w:p/>
           <w:p>
             <w:pPr>
               <w:spacing w:after="0"/>
@@ -3920,8 +4399,8 @@
               <w:bottom w:w="120" w:type="dxa"/>
               <w:end w:w="140" w:type="dxa"/>
             </w:tcMar>
+            <w:vAlign w:val="top"/>
           </w:tcPr>
-          <w:p/>
           <w:p>
             <w:pPr>
               <w:spacing w:after="0"/>
@@ -3959,11 +4438,11 @@
               <w:bottom w:w="160" w:type="dxa"/>
               <w:end w:w="160" w:type="dxa"/>
             </w:tcMar>
+            <w:vAlign w:val="top"/>
           </w:tcPr>
-          <w:p/>
           <w:p>
             <w:pPr>
-              <w:spacing w:after="120"/>
+              <w:spacing w:after="40"/>
             </w:pPr>
             <w:r>
               <w:rPr>
@@ -3993,7 +4472,7 @@
           </w:p>
           <w:p>
             <w:pPr>
-              <w:spacing w:after="120"/>
+              <w:spacing w:after="40"/>
             </w:pPr>
             <w:r>
               <w:rPr>
@@ -4025,11 +4504,11 @@
               <w:bottom w:w="160" w:type="dxa"/>
               <w:end w:w="160" w:type="dxa"/>
             </w:tcMar>
+            <w:vAlign w:val="top"/>
           </w:tcPr>
-          <w:p/>
           <w:p>
             <w:pPr>
-              <w:spacing w:after="120"/>
+              <w:spacing w:after="40"/>
             </w:pPr>
             <w:r>
               <w:rPr>
@@ -4059,7 +4538,7 @@
           </w:p>
           <w:p>
             <w:pPr>
-              <w:spacing w:after="120"/>
+              <w:spacing w:after="40"/>
             </w:pPr>
             <w:r>
               <w:rPr>
@@ -4123,6 +4602,7 @@
               <w:insideH w:val="nil"/>
               <w:insideV w:val="nil"/>
             </w:tcBorders>
+            <w:vAlign w:val="top"/>
           </w:tcPr>
           <w:p>
             <w:pPr>
@@ -4290,6 +4770,7 @@
               <w:insideH w:val="nil"/>
               <w:insideV w:val="nil"/>
             </w:tcBorders>
+            <w:vAlign w:val="top"/>
           </w:tcPr>
           <w:p>
             <w:pPr>
@@ -4332,8 +4813,8 @@
               <w:bottom w:w="100" w:type="dxa"/>
               <w:end w:w="120" w:type="dxa"/>
             </w:tcMar>
+            <w:vAlign w:val="top"/>
           </w:tcPr>
-          <w:p/>
           <w:p>
             <w:pPr>
               <w:spacing w:after="0"/>
@@ -4360,8 +4841,8 @@
               <w:bottom w:w="100" w:type="dxa"/>
               <w:end w:w="120" w:type="dxa"/>
             </w:tcMar>
+            <w:vAlign w:val="top"/>
           </w:tcPr>
-          <w:p/>
           <w:p>
             <w:pPr>
               <w:spacing w:after="0"/>
@@ -4391,11 +4872,11 @@
               <w:bottom w:w="100" w:type="dxa"/>
               <w:end w:w="120" w:type="dxa"/>
             </w:tcMar>
+            <w:vAlign w:val="top"/>
           </w:tcPr>
-          <w:p/>
           <w:p>
             <w:pPr>
-              <w:spacing w:after="120"/>
+              <w:spacing w:after="40"/>
             </w:pPr>
             <w:r>
               <w:rPr>
@@ -4419,11 +4900,11 @@
               <w:bottom w:w="100" w:type="dxa"/>
               <w:end w:w="120" w:type="dxa"/>
             </w:tcMar>
+            <w:vAlign w:val="top"/>
           </w:tcPr>
-          <w:p/>
           <w:p>
             <w:pPr>
-              <w:spacing w:after="120"/>
+              <w:spacing w:after="40"/>
             </w:pPr>
             <w:r>
               <w:rPr>
@@ -4520,8 +5001,8 @@
               <w:insideH w:val="nil"/>
               <w:insideV w:val="nil"/>
             </w:tcBorders>
+            <w:vAlign w:val="top"/>
           </w:tcPr>
-          <w:p/>
           <w:p>
             <w:pPr>
               <w:spacing w:after="0"/>
@@ -4586,6 +5067,7 @@
               <w:insideH w:val="nil"/>
               <w:insideV w:val="nil"/>
             </w:tcBorders>
+            <w:vAlign w:val="top"/>
           </w:tcPr>
           <w:p>
             <w:pPr>
@@ -4629,8 +5111,8 @@
               <w:bottom w:w="100" w:type="dxa"/>
               <w:end w:w="100" w:type="dxa"/>
             </w:tcMar>
+            <w:vAlign w:val="top"/>
           </w:tcPr>
-          <w:p/>
           <w:p>
             <w:pPr>
               <w:spacing w:after="0"/>
@@ -4658,8 +5140,8 @@
               <w:bottom w:w="100" w:type="dxa"/>
               <w:end w:w="100" w:type="dxa"/>
             </w:tcMar>
+            <w:vAlign w:val="top"/>
           </w:tcPr>
-          <w:p/>
           <w:p>
             <w:pPr>
               <w:spacing w:after="0"/>
@@ -4687,8 +5169,8 @@
               <w:bottom w:w="100" w:type="dxa"/>
               <w:end w:w="100" w:type="dxa"/>
             </w:tcMar>
+            <w:vAlign w:val="top"/>
           </w:tcPr>
-          <w:p/>
           <w:p>
             <w:pPr>
               <w:spacing w:after="0"/>
@@ -4718,11 +5200,11 @@
               <w:bottom w:w="100" w:type="dxa"/>
               <w:end w:w="100" w:type="dxa"/>
             </w:tcMar>
+            <w:vAlign w:val="top"/>
           </w:tcPr>
-          <w:p/>
           <w:p>
             <w:pPr>
-              <w:spacing w:after="120"/>
+              <w:spacing w:after="40"/>
             </w:pPr>
             <w:r>
               <w:rPr>
@@ -4746,11 +5228,11 @@
               <w:bottom w:w="100" w:type="dxa"/>
               <w:end w:w="100" w:type="dxa"/>
             </w:tcMar>
+            <w:vAlign w:val="top"/>
           </w:tcPr>
-          <w:p/>
           <w:p>
             <w:pPr>
-              <w:spacing w:after="120"/>
+              <w:spacing w:after="40"/>
             </w:pPr>
             <w:r>
               <w:rPr>
@@ -4774,11 +5256,11 @@
               <w:bottom w:w="100" w:type="dxa"/>
               <w:end w:w="100" w:type="dxa"/>
             </w:tcMar>
+            <w:vAlign w:val="top"/>
           </w:tcPr>
-          <w:p/>
           <w:p>
             <w:pPr>
-              <w:spacing w:after="120"/>
+              <w:spacing w:after="40"/>
             </w:pPr>
             <w:r>
               <w:rPr>
@@ -4882,6 +5364,7 @@
               <w:insideH w:val="nil"/>
               <w:insideV w:val="nil"/>
             </w:tcBorders>
+            <w:vAlign w:val="top"/>
           </w:tcPr>
           <w:p>
             <w:pPr>
@@ -4930,8 +5413,8 @@
               <w:bottom w:w="120" w:type="dxa"/>
               <w:end w:w="80" w:type="dxa"/>
             </w:tcMar>
+            <w:vAlign w:val="top"/>
           </w:tcPr>
-          <w:p/>
           <w:p>
             <w:pPr>
               <w:spacing w:after="0"/>
@@ -4983,8 +5466,8 @@
               <w:bottom w:w="120" w:type="dxa"/>
               <w:end w:w="80" w:type="dxa"/>
             </w:tcMar>
+            <w:vAlign w:val="top"/>
           </w:tcPr>
-          <w:p/>
           <w:p>
             <w:pPr>
               <w:spacing w:after="0"/>
@@ -5036,8 +5519,8 @@
               <w:bottom w:w="120" w:type="dxa"/>
               <w:end w:w="80" w:type="dxa"/>
             </w:tcMar>
+            <w:vAlign w:val="top"/>
           </w:tcPr>
-          <w:p/>
           <w:p>
             <w:pPr>
               <w:spacing w:after="0"/>
@@ -5089,8 +5572,8 @@
               <w:bottom w:w="120" w:type="dxa"/>
               <w:end w:w="80" w:type="dxa"/>
             </w:tcMar>
+            <w:vAlign w:val="top"/>
           </w:tcPr>
-          <w:p/>
           <w:p>
             <w:pPr>
               <w:spacing w:after="0"/>
@@ -5173,8 +5656,8 @@
               <w:insideH w:val="nil"/>
               <w:insideV w:val="nil"/>
             </w:tcBorders>
+            <w:vAlign w:val="top"/>
           </w:tcPr>
-          <w:p/>
           <w:p>
             <w:pPr>
               <w:spacing w:after="0"/>
@@ -5239,6 +5722,7 @@
               <w:insideH w:val="nil"/>
               <w:insideV w:val="nil"/>
             </w:tcBorders>
+            <w:vAlign w:val="top"/>
           </w:tcPr>
           <w:p>
             <w:pPr>

</xml_diff>